<commit_message>
feat: add portfolio link to CV and integrate retail MEP & RDD project experience across portfolio
</commit_message>
<xml_diff>
--- a/cv_generator/Mahfouz_Salah_CV_RDD_MEP.docx
+++ b/cv_generator/Mahfouz_Salah_CV_RDD_MEP.docx
@@ -30,16 +30,74 @@
     </w:p>
     <w:p>
       <w:pPr>
+        <w:spacing w:after="20"/>
         <w:jc w:val="center"/>
       </w:pPr>
       <w:r>
         <w:rPr>
           <w:sz w:val="16"/>
         </w:rPr>
-        <w:t>Cairo, Egypt  |  +2 01027629474  |  +2 01221833667  |  Mahfouzsoliman2021@gmail.com</w:t>
-        <w:br/>
-        <w:t>linkedin.com/in/mahfouz-salah-suleiman-9058b2207</w:t>
+        <w:t xml:space="preserve">Cairo, Egypt   |   +2 01027629474   |   +2 01221833667   |   </w:t>
       </w:r>
+      <w:hyperlink r:id="rId9">
+        <w:r>
+          <w:rPr>
+            <w:color w:val="146677"/>
+            <w:u w:val="single"/>
+            <w:sz w:val="16"/>
+          </w:rPr>
+          <w:t>Mahfouzsoliman2021@gmail.com</w:t>
+        </w:r>
+      </w:hyperlink>
+    </w:p>
+    <w:p>
+      <w:pPr>
+        <w:spacing w:after="50"/>
+        <w:jc w:val="center"/>
+      </w:pPr>
+      <w:r>
+        <w:rPr>
+          <w:b/>
+          <w:color w:val="14354C"/>
+          <w:sz w:val="16"/>
+        </w:rPr>
+        <w:t xml:space="preserve">LinkedIn: </w:t>
+      </w:r>
+      <w:hyperlink r:id="rId10">
+        <w:r>
+          <w:rPr>
+            <w:color w:val="146677"/>
+            <w:u w:val="single"/>
+            <w:sz w:val="16"/>
+          </w:rPr>
+          <w:t>linkedin.com/in/mahfouz-salah-suleiman-9058b2207</w:t>
+        </w:r>
+      </w:hyperlink>
+      <w:r>
+        <w:rPr>
+          <w:color w:val="788796"/>
+          <w:sz w:val="16"/>
+        </w:rPr>
+        <w:t xml:space="preserve">   |   </w:t>
+      </w:r>
+      <w:r>
+        <w:rPr>
+          <w:b/>
+          <w:color w:val="14354C"/>
+          <w:sz w:val="16"/>
+        </w:rPr>
+        <w:t xml:space="preserve">Portfolio: </w:t>
+      </w:r>
+      <w:hyperlink r:id="rId11">
+        <w:r>
+          <w:rPr>
+            <w:color w:val="146677"/>
+            <w:u w:val="single"/>
+            <w:sz w:val="16"/>
+          </w:rPr>
+          <w:t>portfolio.mahfouz-salah.workers.dev</w:t>
+        </w:r>
+      </w:hyperlink>
     </w:p>
     <w:p>
       <w:pPr>

</xml_diff>

<commit_message>
feat: update portfolio title and add 60 Feddan Club Mall project under Mega Plan oversight
</commit_message>
<xml_diff>
--- a/cv_generator/Mahfouz_Salah_CV_RDD_MEP.docx
+++ b/cv_generator/Mahfouz_Salah_CV_RDD_MEP.docx
@@ -25,7 +25,7 @@
           <w:color w:val="146677"/>
           <w:sz w:val="17"/>
         </w:rPr>
-        <w:t>FACILITIES &amp; MEP | RETAIL DESIGN &amp; DELIVERY | TENANT FIT-OUT &amp; TECHNICAL OVERSIGHT</w:t>
+        <w:t>FACILITIES MANAGER | MEP SYSTEMS | RETAIL DESIGN &amp; DELIVERY (RDD) | SHOPPING MALL OPERATIONS &amp; TECHNICAL OVERSIGHT</w:t>
       </w:r>
     </w:p>
     <w:p>
@@ -315,7 +315,17 @@
         <w:ind w:left="259" w:hanging="173"/>
       </w:pPr>
       <w:r>
-        <w:t>Support tenant fit-outs across East Plaza Mall, Kayan Plaza Mall, Souq El Madina Mall and 60 Feddan Club Mall (approximately 11 tenant fit-outs collectively).</w:t>
+        <w:t>60 Feddan Club Mall: Manage MEP technical reviews, base-building interfaces, tenant submittal audits (power, HVAC, plumbing) to protect central plant capacity, and Civil Defense fire/life-safety inspections.</w:t>
+      </w:r>
+    </w:p>
+    <w:p>
+      <w:pPr>
+        <w:pStyle w:val="ListBullet"/>
+        <w:spacing w:after="20"/>
+        <w:ind w:left="259" w:hanging="173"/>
+      </w:pPr>
+      <w:r>
+        <w:t>Support tenant fit-outs across East Plaza Mall, Kayan Plaza Mall, and Souq El Madina Mall (approximately 11 tenant fit-outs collectively).</w:t>
       </w:r>
     </w:p>
     <w:p>

</xml_diff>